<commit_message>
Contrato Aste: punteos uno por linea (N.-) y firma en tabla de dos columnas
Co-Authored-By: Claude Opus 4.8 <noreply@anthropic.com>
</commit_message>
<xml_diff>
--- a/app/plantillas/ASTE 77417616-0/CONTRATO JEFA PRODUCCION FT - Indefinido.docx
+++ b/app/plantillas/ASTE 77417616-0/CONTRATO JEFA PRODUCCION FT - Indefinido.docx
@@ -65,40 +65,341 @@
         <w:rPr>
           <w:b/>
         </w:rPr>
-        <w:t xml:space="preserve">A. Funciones. </w:t>
-      </w:r>
-      <w:r>
-        <w:t xml:space="preserve">1. Dirección y Ejecución Culinaria: Liderar el servicio diario (producción y reposición de materias primas) para garantizar que cada plato salga bajo los estándares de calidad, gestionando al equipo de cocina mediante capacitaciones internas a los cocineros. 2. Gestión de Equipo: (Junto al dueño) Supervisar, capacitar y organizar los turnos del personal a su cargo (cocineros, ayudantes, copería). Velar por la disciplina, el uso correcto del uniforme y el clima laboral dentro de la cocina. 3. Control de Stock y Costos (Food Cost): Gestionar el inventario de materias primas, realizar los pedidos a proveedores autorizados, recepcionar mercadería verificando calidad/peso y asegurar el almacenamiento bajo estricto sistema FIFO (primero en entrar, primero en salir) para minimizar mermas y desperdicios. 4. Seguridad e Higiene (HACCP): Garantizar el cumplimiento del Reglamento Sanitario de los Alimentos. Supervisar el aseo profundo de equipos (freidoras, hornos, planchas, refrigeradores y campanas), el control de temperaturas y la manipulación higiénica de alimentos. 5. Desarrollo de Carta: Colaborar con la administración en la creación, costeo y actualización de la oferta gastronómica (menú), proponiendo platos eficientes y atractivos para el perfil del local. 6. Funciones conexas: Dada la dinámica del establecimiento, la Trabajadora acepta colaborar en tareas conexas ante necesidades operativas, tales como apoyo en el lavado de vajilla (copería) en momentos críticos o cierre de local, sin que ello signifique menoscabo.</w:t>
-      </w:r>
-    </w:p>
-    <w:p>
-      <w:pPr>
-        <w:jc w:val="both"/>
-        <w:spacing w:after="160"/>
-      </w:pPr>
-      <w:r>
-        <w:rPr>
-          <w:b/>
-        </w:rPr>
-        <w:t xml:space="preserve">B. Obligaciones. </w:t>
-      </w:r>
-      <w:r>
-        <w:t xml:space="preserve">1. Llegar puntualmente a su lugar de trabajo. 2. Realizar personalmente la labor convenida. 3. Efectuar el trabajo de acuerdo con las órdenes e instrucciones que emanen de la administración de la empresa, así como las recibidas de sus jefes directos. 4. Ser respetuosa con sus superiores y compañeros de trabajo, y observar las órdenes que los primeros impartan en orden al buen servicio y/o los intereses de la empresa. 5. Registrar diariamente su hora de entrada y salida en el Libro de Asistencia o mecanismo afín. Se considerará falta grave que la trabajadora registre indebidamente su asistencia en el Libro o que éste sea firmado por otro u otros funcionarios. 6. Observar, en todo momento, una conducta correcta y honorable, y desempeñar sus funciones con dignidad y responsabilidad. 7. Cumplir íntegramente la jornada diaria y semanal de trabajo a la que se encuentre afecta. 8. Informar, mínimo sesenta minutos antes del inicio de sus labores, cualquier impedimento que la haya imposibilitado de concurrir, justificando su inasistencia dentro de las cuarenta y ocho horas a partir de ese momento, con la respectiva licencia médica. 9. Dar aviso de inmediato de cualquier desperfecto que se detecte en los elementos de trabajo o instalaciones de la empresa, a efecto de evitar daños mayores. 10. Mantener en orden, higiene y aseo el lugar donde desempeñe sus labores. 11. Mantener siempre una excelente presencia y aspecto personal (Anexo de presentación personal). 12. Cuidar con esmero las máquinas, implementos, equipos, instalaciones y útiles que se le entreguen para el desempeño de sus labores, los cuales deberá dejar limpios y/o guardados al término de su jornada. Ante cualquier destrucción, éstos serán reparados y su arreglo o reemplazo será de cargo de la trabajadora. Esto no procederá cuando la destrucción sea a causa de su normal uso y desgaste. 13. Proceder a devolver todos los elementos puestos a su servicio antes de cursar la firma del respectivo finiquito legal.</w:t>
-      </w:r>
-    </w:p>
-    <w:p>
-      <w:pPr>
-        <w:jc w:val="both"/>
-        <w:spacing w:after="160"/>
-      </w:pPr>
-      <w:r>
-        <w:rPr>
-          <w:b/>
-        </w:rPr>
-        <w:t xml:space="preserve">C. Prohibiciones. </w:t>
-      </w:r>
-      <w:r>
-        <w:t xml:space="preserve">1. Consumo de Alcohol y Drogas: Queda estrictamente prohibido consumir alcohol durante el horario laboral, ya sea alcohol del inventario del local o ingresado de forma oculta a su lugar de trabajo; así como el consumo, manipulación o tráfico de drogas dentro de su jornada laboral (incluyendo descanso). 2. Trato al Cliente: Discusiones, faltas de respeto o negligencia que afecten la imagen del local. 3. Seguridad: Dejar el local abierto o sin alarma de cierre, o, de manera negligente, permitir sustracciones de insumos, dinero o productos del local. El incumplimiento de alguna de las disposiciones indicadas en los puntos A, B y C, así como el incurrir en alguna de las prohibiciones, constituye incumplimiento grave de las obligaciones que le impone el contrato, siendo causal suficiente para poner término inmediato a éste.</w:t>
+        <w:t xml:space="preserve">A. Funciones.</w:t>
+      </w:r>
+    </w:p>
+    <w:p>
+      <w:pPr>
+        <w:jc w:val="both"/>
+        <w:ind w:left="357"/>
+        <w:spacing w:after="60"/>
+      </w:pPr>
+      <w:r>
+        <w:t xml:space="preserve">1.- </w:t>
+      </w:r>
+      <w:r>
+        <w:rPr>
+          <w:b/>
+        </w:rPr>
+        <w:t xml:space="preserve">Dirección y Ejecución Culinaria: </w:t>
+      </w:r>
+      <w:r>
+        <w:t xml:space="preserve">Liderar el servicio diario (producción y reposición de materias primas) para garantizar que cada plato salga bajo los estándares de calidad, gestionando al equipo de cocina mediante capacitaciones internas a los cocineros.</w:t>
+      </w:r>
+    </w:p>
+    <w:p>
+      <w:pPr>
+        <w:jc w:val="both"/>
+        <w:ind w:left="357"/>
+        <w:spacing w:after="60"/>
+      </w:pPr>
+      <w:r>
+        <w:t xml:space="preserve">2.- </w:t>
+      </w:r>
+      <w:r>
+        <w:rPr>
+          <w:b/>
+        </w:rPr>
+        <w:t xml:space="preserve">Gestión de Equipo: </w:t>
+      </w:r>
+      <w:r>
+        <w:t xml:space="preserve">(Junto al dueño) Supervisar, capacitar y organizar los turnos del personal a su cargo (cocineros, ayudantes, copería). Velar por la disciplina, el uso correcto del uniforme y el clima laboral dentro de la cocina.</w:t>
+      </w:r>
+    </w:p>
+    <w:p>
+      <w:pPr>
+        <w:jc w:val="both"/>
+        <w:ind w:left="357"/>
+        <w:spacing w:after="60"/>
+      </w:pPr>
+      <w:r>
+        <w:t xml:space="preserve">3.- </w:t>
+      </w:r>
+      <w:r>
+        <w:rPr>
+          <w:b/>
+        </w:rPr>
+        <w:t xml:space="preserve">Control de Stock y Costos (Food Cost): </w:t>
+      </w:r>
+      <w:r>
+        <w:t xml:space="preserve">Gestionar el inventario de materias primas, realizar los pedidos a proveedores autorizados, recepcionar mercadería verificando calidad/peso y asegurar el almacenamiento bajo estricto sistema FIFO para minimizar mermas y desperdicios.</w:t>
+      </w:r>
+    </w:p>
+    <w:p>
+      <w:pPr>
+        <w:jc w:val="both"/>
+        <w:ind w:left="357"/>
+        <w:spacing w:after="60"/>
+      </w:pPr>
+      <w:r>
+        <w:t xml:space="preserve">4.- </w:t>
+      </w:r>
+      <w:r>
+        <w:rPr>
+          <w:b/>
+        </w:rPr>
+        <w:t xml:space="preserve">Seguridad e Higiene (HACCP): </w:t>
+      </w:r>
+      <w:r>
+        <w:t xml:space="preserve">Garantizar el cumplimiento del Reglamento Sanitario de los Alimentos. Supervisar el aseo profundo de equipos (freidoras, hornos, planchas, refrigeradores y campanas), el control de temperaturas y la manipulación higiénica de alimentos.</w:t>
+      </w:r>
+    </w:p>
+    <w:p>
+      <w:pPr>
+        <w:jc w:val="both"/>
+        <w:ind w:left="357"/>
+        <w:spacing w:after="60"/>
+      </w:pPr>
+      <w:r>
+        <w:t xml:space="preserve">5.- </w:t>
+      </w:r>
+      <w:r>
+        <w:rPr>
+          <w:b/>
+        </w:rPr>
+        <w:t xml:space="preserve">Desarrollo de Carta: </w:t>
+      </w:r>
+      <w:r>
+        <w:t xml:space="preserve">Colaborar con la administración en la creación, costeo y actualización de la oferta gastronómica (menú), proponiendo platos eficientes y atractivos para el perfil del local.</w:t>
+      </w:r>
+    </w:p>
+    <w:p>
+      <w:pPr>
+        <w:jc w:val="both"/>
+        <w:ind w:left="357"/>
+        <w:spacing w:after="60"/>
+      </w:pPr>
+      <w:r>
+        <w:t xml:space="preserve">6.- </w:t>
+      </w:r>
+      <w:r>
+        <w:rPr>
+          <w:b/>
+        </w:rPr>
+        <w:t xml:space="preserve">Funciones conexas: </w:t>
+      </w:r>
+      <w:r>
+        <w:t xml:space="preserve">Dada la dinámica del establecimiento, la Trabajadora acepta colaborar en tareas conexas ante necesidades operativas, tales como apoyo en el lavado de vajilla (copería) en momentos críticos o cierre de local, sin que ello signifique menoscabo.</w:t>
+      </w:r>
+    </w:p>
+    <w:p>
+      <w:pPr>
+        <w:jc w:val="both"/>
+        <w:spacing w:after="160"/>
+      </w:pPr>
+      <w:r>
+        <w:rPr>
+          <w:b/>
+        </w:rPr>
+        <w:t xml:space="preserve">B. Obligaciones.</w:t>
+      </w:r>
+    </w:p>
+    <w:p>
+      <w:pPr>
+        <w:jc w:val="both"/>
+        <w:ind w:left="357"/>
+        <w:spacing w:after="60"/>
+      </w:pPr>
+      <w:r>
+        <w:t xml:space="preserve">1.- Llegar puntualmente a su lugar de trabajo.</w:t>
+      </w:r>
+    </w:p>
+    <w:p>
+      <w:pPr>
+        <w:jc w:val="both"/>
+        <w:ind w:left="357"/>
+        <w:spacing w:after="60"/>
+      </w:pPr>
+      <w:r>
+        <w:t xml:space="preserve">2.- Realizar personalmente la labor convenida.</w:t>
+      </w:r>
+    </w:p>
+    <w:p>
+      <w:pPr>
+        <w:jc w:val="both"/>
+        <w:ind w:left="357"/>
+        <w:spacing w:after="60"/>
+      </w:pPr>
+      <w:r>
+        <w:t xml:space="preserve">3.- Efectuar el trabajo de acuerdo con las órdenes e instrucciones que emanen de la administración de la empresa, así como las recibidas de sus jefes directos.</w:t>
+      </w:r>
+    </w:p>
+    <w:p>
+      <w:pPr>
+        <w:jc w:val="both"/>
+        <w:ind w:left="357"/>
+        <w:spacing w:after="60"/>
+      </w:pPr>
+      <w:r>
+        <w:t xml:space="preserve">4.- Ser respetuosa con sus superiores y compañeros de trabajo, y observar las órdenes que los primeros impartan en orden al buen servicio y/o los intereses de la empresa.</w:t>
+      </w:r>
+    </w:p>
+    <w:p>
+      <w:pPr>
+        <w:jc w:val="both"/>
+        <w:ind w:left="357"/>
+        <w:spacing w:after="60"/>
+      </w:pPr>
+      <w:r>
+        <w:t xml:space="preserve">5.- Registrar diariamente su hora de entrada y salida en el Libro de Asistencia o mecanismo afín. Se considerará falta grave que la trabajadora registre indebidamente su asistencia o que éste sea firmado por otro u otros funcionarios.</w:t>
+      </w:r>
+    </w:p>
+    <w:p>
+      <w:pPr>
+        <w:jc w:val="both"/>
+        <w:ind w:left="357"/>
+        <w:spacing w:after="60"/>
+      </w:pPr>
+      <w:r>
+        <w:t xml:space="preserve">6.- Observar, en todo momento, una conducta correcta y honorable, y desempeñar sus funciones con dignidad y responsabilidad.</w:t>
+      </w:r>
+    </w:p>
+    <w:p>
+      <w:pPr>
+        <w:jc w:val="both"/>
+        <w:ind w:left="357"/>
+        <w:spacing w:after="60"/>
+      </w:pPr>
+      <w:r>
+        <w:t xml:space="preserve">7.- Cumplir íntegramente la jornada diaria y semanal de trabajo a la que se encuentre afecta.</w:t>
+      </w:r>
+    </w:p>
+    <w:p>
+      <w:pPr>
+        <w:jc w:val="both"/>
+        <w:ind w:left="357"/>
+        <w:spacing w:after="60"/>
+      </w:pPr>
+      <w:r>
+        <w:t xml:space="preserve">8.- Informar, mínimo sesenta minutos antes del inicio de sus labores, cualquier impedimento que la haya imposibilitado de concurrir, justificando su inasistencia dentro de las cuarenta y ocho horas a partir de ese momento, con la respectiva licencia médica.</w:t>
+      </w:r>
+    </w:p>
+    <w:p>
+      <w:pPr>
+        <w:jc w:val="both"/>
+        <w:ind w:left="357"/>
+        <w:spacing w:after="60"/>
+      </w:pPr>
+      <w:r>
+        <w:t xml:space="preserve">9.- Dar aviso de inmediato de cualquier desperfecto que se detecte en los elementos de trabajo o instalaciones de la empresa, a efecto de evitar daños mayores.</w:t>
+      </w:r>
+    </w:p>
+    <w:p>
+      <w:pPr>
+        <w:jc w:val="both"/>
+        <w:ind w:left="357"/>
+        <w:spacing w:after="60"/>
+      </w:pPr>
+      <w:r>
+        <w:t xml:space="preserve">10.- Mantener en orden, higiene y aseo el lugar donde desempeñe sus labores.</w:t>
+      </w:r>
+    </w:p>
+    <w:p>
+      <w:pPr>
+        <w:jc w:val="both"/>
+        <w:ind w:left="357"/>
+        <w:spacing w:after="60"/>
+      </w:pPr>
+      <w:r>
+        <w:t xml:space="preserve">11.- Mantener siempre una excelente presencia y aspecto personal (Anexo de presentación personal).</w:t>
+      </w:r>
+    </w:p>
+    <w:p>
+      <w:pPr>
+        <w:jc w:val="both"/>
+        <w:ind w:left="357"/>
+        <w:spacing w:after="60"/>
+      </w:pPr>
+      <w:r>
+        <w:t xml:space="preserve">12.- Cuidar con esmero las máquinas, implementos, equipos, instalaciones y útiles que se le entreguen para el desempeño de sus labores, los cuales deberá dejar limpios y/o guardados al término de su jornada. Ante cualquier destrucción, éstos serán reparados y su arreglo o reemplazo será de cargo de la trabajadora, salvo que la destrucción sea a causa de su normal uso y desgaste.</w:t>
+      </w:r>
+    </w:p>
+    <w:p>
+      <w:pPr>
+        <w:jc w:val="both"/>
+        <w:ind w:left="357"/>
+        <w:spacing w:after="60"/>
+      </w:pPr>
+      <w:r>
+        <w:t xml:space="preserve">13.- Proceder a devolver todos los elementos puestos a su servicio antes de cursar la firma del respectivo finiquito legal.</w:t>
+      </w:r>
+    </w:p>
+    <w:p>
+      <w:pPr>
+        <w:jc w:val="both"/>
+        <w:spacing w:after="160"/>
+      </w:pPr>
+      <w:r>
+        <w:rPr>
+          <w:b/>
+        </w:rPr>
+        <w:t xml:space="preserve">C. Prohibiciones.</w:t>
+      </w:r>
+    </w:p>
+    <w:p>
+      <w:pPr>
+        <w:jc w:val="both"/>
+        <w:ind w:left="357"/>
+        <w:spacing w:after="60"/>
+      </w:pPr>
+      <w:r>
+        <w:t xml:space="preserve">1.- </w:t>
+      </w:r>
+      <w:r>
+        <w:rPr>
+          <w:b/>
+        </w:rPr>
+        <w:t xml:space="preserve">Consumo de Alcohol y Drogas: </w:t>
+      </w:r>
+      <w:r>
+        <w:t xml:space="preserve">Queda estrictamente prohibido consumir alcohol durante el horario laboral, ya sea del inventario del local o ingresado de forma oculta; así como el consumo, manipulación o tráfico de drogas dentro de su jornada laboral (incluyendo descanso).</w:t>
+      </w:r>
+    </w:p>
+    <w:p>
+      <w:pPr>
+        <w:jc w:val="both"/>
+        <w:ind w:left="357"/>
+        <w:spacing w:after="60"/>
+      </w:pPr>
+      <w:r>
+        <w:t xml:space="preserve">2.- </w:t>
+      </w:r>
+      <w:r>
+        <w:rPr>
+          <w:b/>
+        </w:rPr>
+        <w:t xml:space="preserve">Trato al Cliente: </w:t>
+      </w:r>
+      <w:r>
+        <w:t xml:space="preserve">Discusiones, faltas de respeto o negligencia que afecten la imagen del local.</w:t>
+      </w:r>
+    </w:p>
+    <w:p>
+      <w:pPr>
+        <w:jc w:val="both"/>
+        <w:ind w:left="357"/>
+        <w:spacing w:after="60"/>
+      </w:pPr>
+      <w:r>
+        <w:t xml:space="preserve">3.- </w:t>
+      </w:r>
+      <w:r>
+        <w:rPr>
+          <w:b/>
+        </w:rPr>
+        <w:t xml:space="preserve">Seguridad: </w:t>
+      </w:r>
+      <w:r>
+        <w:t xml:space="preserve">Dejar el local abierto o sin alarma de cierre, o, de manera negligente, permitir sustracciones de insumos, dinero o productos del local.</w:t>
+      </w:r>
+    </w:p>
+    <w:p>
+      <w:pPr>
+        <w:jc w:val="both"/>
+        <w:spacing w:after="160"/>
+      </w:pPr>
+      <w:r>
+        <w:t xml:space="preserve">El incumplimiento de alguna de las disposiciones indicadas en los puntos A, B y C, así como el incurrir en alguna de las prohibiciones, constituye incumplimiento grave de las obligaciones que le impone el contrato, siendo causal suficiente para poner término inmediato a éste.</w:t>
       </w:r>
     </w:p>
     <w:p>
@@ -128,7 +429,37 @@
         <w:t xml:space="preserve">TERCERO: </w:t>
       </w:r>
       <w:r>
-        <w:t xml:space="preserve">El Empleador se compromete a remunerar a la Trabajadora en la forma que se indica: 1) Sueldo Base: ${SUELDO_BASE} ({SUELDO_BASE_PALABRA}). 2) Asignación de Movilización: ${ASIGNACION_MOVILIZACION} ({ASIGNACION_MOVILIZACION_PALABRA}). 3) Asignación de Colación: ${ASIGNACION_COLACION} ({ASIGNACION_COLACION_PALABRA}).</w:t>
+        <w:t xml:space="preserve">El Empleador se compromete a remunerar a la Trabajadora en la forma que se indica:</w:t>
+      </w:r>
+    </w:p>
+    <w:p>
+      <w:pPr>
+        <w:jc w:val="both"/>
+        <w:ind w:left="357"/>
+        <w:spacing w:after="60"/>
+      </w:pPr>
+      <w:r>
+        <w:t xml:space="preserve">1.- Sueldo Base: ${SUELDO_BASE} ({SUELDO_BASE_PALABRA}).</w:t>
+      </w:r>
+    </w:p>
+    <w:p>
+      <w:pPr>
+        <w:jc w:val="both"/>
+        <w:ind w:left="357"/>
+        <w:spacing w:after="60"/>
+      </w:pPr>
+      <w:r>
+        <w:t xml:space="preserve">2.- Asignación de Movilización: ${ASIGNACION_MOVILIZACION} ({ASIGNACION_MOVILIZACION_PALABRA}).</w:t>
+      </w:r>
+    </w:p>
+    <w:p>
+      <w:pPr>
+        <w:jc w:val="both"/>
+        <w:ind w:left="357"/>
+        <w:spacing w:after="60"/>
+      </w:pPr>
+      <w:r>
+        <w:t xml:space="preserve">3.- Asignación de Colación: ${ASIGNACION_COLACION} ({ASIGNACION_COLACION_PALABRA}).</w:t>
       </w:r>
     </w:p>
     <w:p>
@@ -301,18 +632,6 @@
         <w:jc w:val="both"/>
         <w:spacing w:after="160"/>
       </w:pPr>
-    </w:p>
-    <w:p>
-      <w:pPr>
-        <w:jc w:val="both"/>
-        <w:spacing w:after="160"/>
-      </w:pPr>
-    </w:p>
-    <w:p>
-      <w:pPr>
-        <w:jc w:val="both"/>
-        <w:spacing w:after="160"/>
-      </w:pPr>
       <w:r>
         <w:t xml:space="preserve">{CLAUSULAS_ADICIONALES}</w:t>
       </w:r>
@@ -325,43 +644,111 @@
     </w:p>
     <w:p>
       <w:pPr>
+        <w:jc w:val="both"/>
+        <w:spacing w:after="160"/>
+      </w:pPr>
+    </w:p>
+    <w:tbl>
+      <w:tblPr>
+        <w:tblW w:w="0" w:type="auto"/>
         <w:jc w:val="center"/>
-        <w:spacing w:after="160"/>
-      </w:pPr>
-      <w:r>
-        <w:t xml:space="preserve">_______________________________          _______________________________</w:t>
-      </w:r>
-    </w:p>
-    <w:p>
-      <w:pPr>
-        <w:jc w:val="center"/>
-        <w:spacing w:after="160"/>
-      </w:pPr>
-      <w:r>
-        <w:t xml:space="preserve">{RAZON_SOCIAL}                                   {NOMBRE_EMPLEADO}</w:t>
-      </w:r>
-    </w:p>
-    <w:p>
-      <w:pPr>
-        <w:jc w:val="center"/>
-        <w:spacing w:after="160"/>
-      </w:pPr>
-      <w:r>
-        <w:t xml:space="preserve">RUT {RUT_EMPRESA}                              RUT {RUT_EMPLEADO}</w:t>
-      </w:r>
-    </w:p>
-    <w:p>
-      <w:pPr>
-        <w:jc w:val="center"/>
-        <w:spacing w:after="160"/>
-      </w:pPr>
-      <w:r>
-        <w:rPr>
-          <w:b/>
-        </w:rPr>
-        <w:t xml:space="preserve">EMPLEADOR                                              TRABAJADORA</w:t>
-      </w:r>
-    </w:p>
+        <w:tblBorders>
+          <w:top w:val="none" w:sz="0" w:space="0"/>
+          <w:left w:val="none" w:sz="0" w:space="0"/>
+          <w:bottom w:val="none" w:sz="0" w:space="0"/>
+          <w:right w:val="none" w:sz="0" w:space="0"/>
+          <w:insideH w:val="none" w:sz="0" w:space="0"/>
+          <w:insideV w:val="none" w:sz="0" w:space="0"/>
+        </w:tblBorders>
+        <w:tblLook w:val="0000"/>
+      </w:tblPr>
+      <w:tblGrid>
+        <w:gridCol w:w="4500"/>
+        <w:gridCol w:w="4500"/>
+      </w:tblGrid>
+      <w:tr>
+        <w:tc>
+          <w:tcPr>
+            <w:tcW w:w="4500" w:type="dxa"/>
+          </w:tcPr>
+          <w:p>
+            <w:pPr>
+              <w:jc w:val="center"/>
+            </w:pPr>
+            <w:r>
+              <w:t xml:space="preserve">_______________________________</w:t>
+            </w:r>
+          </w:p>
+          <w:p>
+            <w:pPr>
+              <w:jc w:val="center"/>
+            </w:pPr>
+            <w:r>
+              <w:t xml:space="preserve">{RAZON_SOCIAL}</w:t>
+            </w:r>
+          </w:p>
+          <w:p>
+            <w:pPr>
+              <w:jc w:val="center"/>
+            </w:pPr>
+            <w:r>
+              <w:t xml:space="preserve">RUT {RUT_EMPRESA}</w:t>
+            </w:r>
+          </w:p>
+          <w:p>
+            <w:pPr>
+              <w:jc w:val="center"/>
+            </w:pPr>
+            <w:r>
+              <w:rPr>
+                <w:b/>
+              </w:rPr>
+              <w:t xml:space="preserve">EMPLEADOR</w:t>
+            </w:r>
+          </w:p>
+        </w:tc>
+        <w:tc>
+          <w:tcPr>
+            <w:tcW w:w="4500" w:type="dxa"/>
+          </w:tcPr>
+          <w:p>
+            <w:pPr>
+              <w:jc w:val="center"/>
+            </w:pPr>
+            <w:r>
+              <w:t xml:space="preserve">_______________________________</w:t>
+            </w:r>
+          </w:p>
+          <w:p>
+            <w:pPr>
+              <w:jc w:val="center"/>
+            </w:pPr>
+            <w:r>
+              <w:t xml:space="preserve">{NOMBRE_EMPLEADO}</w:t>
+            </w:r>
+          </w:p>
+          <w:p>
+            <w:pPr>
+              <w:jc w:val="center"/>
+            </w:pPr>
+            <w:r>
+              <w:t xml:space="preserve">RUT {RUT_EMPLEADO}</w:t>
+            </w:r>
+          </w:p>
+          <w:p>
+            <w:pPr>
+              <w:jc w:val="center"/>
+            </w:pPr>
+            <w:r>
+              <w:rPr>
+                <w:b/>
+              </w:rPr>
+              <w:t xml:space="preserve">TRABAJADORA</w:t>
+            </w:r>
+          </w:p>
+        </w:tc>
+      </w:tr>
+    </w:tbl>
     <w:sectPr>
       <w:pgSz w:w="12240" w:h="15840"/>
       <w:pgMar w:top="1417" w:right="1701" w:bottom="1417" w:left="1701" w:header="708" w:footer="708" w:gutter="0"/>

</xml_diff>